<commit_message>
Docs (DB refactor step 14): test plan 0.3 -- 0_tests coverage, API snapshot regression, live-change rehearsal
Co-Authored-By: Claude Opus 5.5 <noreply@anthropic.com>
</commit_message>
<xml_diff>
--- a/0_documentation/testPlan_0.1.docx
+++ b/0_documentation/testPlan_0.1.docx
@@ -203,7 +203,7 @@
               <w:rPr>
                 <w:rFonts w:eastAsia="Courier New"/>
               </w:rPr>
-              <w:t>0.2</w:t>
+              <w:t>0.3</w:t>
             </w:r>
           </w:p>
         </w:tc>
@@ -249,7 +249,7 @@
               <w:rPr>
                 <w:rFonts w:eastAsia="Courier New"/>
               </w:rPr>
-              <w:t>2026-10-09</w:t>
+              <w:t>2026-10-22</w:t>
             </w:r>
           </w:p>
         </w:tc>
@@ -504,7 +504,7 @@
           <w:sz w:val="24"/>
           <w:szCs w:val="24"/>
         </w:rPr>
-        <w:t>The same pytest suite (0_tests/) also covers the Python server and the news pipeline. test_server.py exercises every API endpoint through the WSGI application directly, against the real local databases — including the news topic filter, its SQL-injection safety, and the stored topic counts behind the news histogram. test_newsRules.py tests the news filler and topic rules against real feed titles, both stories that must be caught and look-alikes that must not, plus pruning, six-month retention, tagging and the stored counts against a throwaway in-memory database, never the real one.</w:t>
+        <w:t>The same pytest suite (0_tests/) also covers the Python server and the news pipeline. test_server.py exercises every API endpoint through the WSGI application directly, against the real local databases (the site&lt;Type&gt;.db files since the October 2026 database refactor) — including the news topic filter, its SQL-injection safety, and the stored topic counts behind the news histogram. test_newsRules.py tests the news filler and topic rules against real feed titles, both stories that must be caught and look-alikes that must not, plus pruning, six-month retention, tagging and the stored counts against a throwaway in-memory database, never the real one.</w:t>
       </w:r>
       <w:proofErr w:type="spellStart"/>
       <w:proofErr w:type="spellEnd"/>
@@ -534,6 +534,108 @@
           <w:sz w:val="24"/>
           <w:szCs w:val="24"/>
         </w:rPr>
+        <w:t>Since the database refactor the suite also covers every ingestion source, the publish step and the scripts that run and move it. Run it with python -m pytest 0_tests from the project root. On 2026-10-22: 353 tests in 19 files, 352 passed and 1 skipped (the writers’-lock timeout test, which needs Linux’s fcntl). Source clients are tested against recorded responses (0_tests/fixtures/) and throwaway databases, never the live services or the real databases; the real spacetrack.env is never read.</w:t>
+      </w:r>
+      <w:proofErr w:type="spellStart"/>
+      <w:proofErr w:type="spellEnd"/>
+      <w:proofErr w:type="spellStart"/>
+      <w:proofErr w:type="spellEnd"/>
+      <w:proofErr w:type="gramStart"/>
+      <w:proofErr w:type="gramEnd"/>
+      <w:proofErr w:type="spellStart"/>
+      <w:proofErr w:type="spellEnd"/>
+    </w:p>
+    <w:p>
+      <w:pPr>
+        <w:pStyle w:val="ListParagraph"/>
+        <w:numPr>
+          <w:ilvl w:val="0"/>
+          <w:numId w:val="18"/>
+        </w:numPr>
+      </w:pPr>
+      <w:r>
+        <w:t>Ingestion, one file per source: test_ingestionSpaceTrack.py (17 — full and recent passes, newer-epoch-only updates, decays, failures recorded), test_ingestionCelesTrak.py (15 — the enable switch and 72-hour interval, per-group replacement, kept radar figures), test_ingestionSatNOGS.py (13 — the TLE crosswalk and transmitters, each feed failing independently), test_ingestGcat.py (22), test_readNews.py (10 — RSS parsing, dates, database set-up), test_ingestionLog.py (4 — the ingestionRuns record every source writes), test_common.py (12 — the .env loader, HTTP GET, the Space-Track client’s login and logout).</w:t>
+      </w:r>
+      <w:proofErr w:type="gramStart"/>
+      <w:proofErr w:type="gramEnd"/>
+      <w:proofErr w:type="spellStart"/>
+      <w:proofErr w:type="spellEnd"/>
+      <w:proofErr w:type="spellStart"/>
+      <w:proofErr w:type="spellEnd"/>
+    </w:p>
+    <w:p>
+      <w:pPr>
+        <w:pStyle w:val="ListParagraph"/>
+        <w:numPr>
+          <w:ilvl w:val="0"/>
+          <w:numId w:val="18"/>
+        </w:numPr>
+      </w:pPr>
+      <w:r>
+        <w:t>Publish and its rules: test_publishSite.py (9 — the build, the atomic swap and .prev, refusal on an empty table or a drop over 10% with the live file untouched, indexes copied, element-age selection, kept CelesTrak radar figures, transmitter linking by follow ID, then designator, then own number), test_groupRules.py (11 — decision A’s precedence, the 3-month recent-launch rule, stale CelesTrak falling back to our rules, CelesTrak-only groups), test_enrichEirp.py (5 — the GCAT class fallback, used only when the groups place nothing), test_rfSelection.py (15), test_estimateBrightness.py (15), test_orbitStats.py (25).</w:t>
+      </w:r>
+      <w:proofErr w:type="gramStart"/>
+      <w:proofErr w:type="gramEnd"/>
+      <w:proofErr w:type="spellStart"/>
+      <w:proofErr w:type="spellEnd"/>
+      <w:proofErr w:type="spellStart"/>
+      <w:proofErr w:type="spellEnd"/>
+    </w:p>
+    <w:p>
+      <w:pPr>
+        <w:pStyle w:val="ListParagraph"/>
+        <w:numPr>
+          <w:ilvl w:val="0"/>
+          <w:numId w:val="18"/>
+        </w:numPr>
+      </w:pPr>
+      <w:r>
+        <w:t>Running and moving the data: test_runIngestion.py (9 — publish only after a successful run with changes, a refused publish failing the run, the writers’ lock), test_dbPaths.py (3 — the databases/ layout and the legacy ingestionDBs/ fallback), test_migrateLive.py (11 — migration preconditions, dry run, backup and rename, rollback, and the reference-database install after a deploy).</w:t>
+      </w:r>
+      <w:proofErr w:type="gramStart"/>
+      <w:proofErr w:type="gramEnd"/>
+      <w:proofErr w:type="spellStart"/>
+      <w:proofErr w:type="spellEnd"/>
+      <w:proofErr w:type="spellStart"/>
+      <w:proofErr w:type="spellEnd"/>
+    </w:p>
+    <w:p>
+      <w:pPr>
+        <w:pStyle w:val="ListParagraph"/>
+        <w:numPr>
+          <w:ilvl w:val="0"/>
+          <w:numId w:val="18"/>
+        </w:numPr>
+      </w:pPr>
+      <w:r>
+        <w:t>Website and tools: test_server.py (101 — every endpoint, plus site files picked up after a swap, the pre-refactor fallback, connections released per request on Windows, and the freshness table), test_newsRules.py (43), test_bugsTool.py (13).</w:t>
+      </w:r>
+      <w:proofErr w:type="gramStart"/>
+      <w:proofErr w:type="gramEnd"/>
+      <w:proofErr w:type="spellStart"/>
+      <w:proofErr w:type="spellEnd"/>
+      <w:proofErr w:type="spellStart"/>
+      <w:proofErr w:type="spellEnd"/>
+    </w:p>
+    <w:p>
+      <w:pPr>
+        <w:pStyle w:val="Heading2"/>
+        <w:rPr>
+          <w:b w:val="0"/>
+          <w:bCs w:val="0"/>
+          <w:color w:val="auto"/>
+          <w:sz w:val="24"/>
+          <w:szCs w:val="24"/>
+        </w:rPr>
+      </w:pPr>
+      <w:r>
+        <w:rPr>
+          <w:b w:val="0"/>
+          <w:bCs w:val="0"/>
+          <w:color w:val="auto"/>
+          <w:sz w:val="24"/>
+          <w:szCs w:val="24"/>
+        </w:rPr>
         <w:t xml:space="preserve">Both suites </w:t>
       </w:r>
       <w:r>
@@ -555,6 +657,78 @@
           <w:szCs w:val="24"/>
         </w:rPr>
         <w:t>run on every relevant commit, are free of network dependency, and together form the first line of defence against regressions.</w:t>
+      </w:r>
+    </w:p>
+    <w:p>
+      <w:pPr>
+        <w:pStyle w:val="Heading2"/>
+      </w:pPr>
+      <w:r>
+        <w:t>API Regression Snapshots</w:t>
+      </w:r>
+    </w:p>
+    <w:p>
+      <w:r>
+        <w:t>For changes that should leave the website’s output alone, or change it only in known ways, the whole API is compared before and after. 0_tools/apiSnapshot.py calls server.py’s WSGI application in-process (no running server needed), against whatever databases the working copy has, and saves the JSON of 359 endpoint and filter combinations: every GET route, every ON-ORBIT chart for each status, kind and SpaceX filter, launches by SpaceX filter and outcome, and sample objects.</w:t>
+      </w:r>
+    </w:p>
+    <w:p>
+      <w:pPr>
+        <w:pStyle w:val="ListParagraph"/>
+        <w:numPr>
+          <w:ilvl w:val="0"/>
+          <w:numId w:val="18"/>
+        </w:numPr>
+      </w:pPr>
+      <w:r>
+        <w:t>python 0_tools/apiSnapshot.py take LABEL — saves a snapshot to 0_testReports/apiSnapshots/LABEL/ (gitignored; snapshots are large and can be regenerated).</w:t>
+      </w:r>
+      <w:proofErr w:type="gramStart"/>
+      <w:proofErr w:type="gramEnd"/>
+      <w:proofErr w:type="spellStart"/>
+      <w:proofErr w:type="spellEnd"/>
+      <w:proofErr w:type="spellStart"/>
+      <w:proofErr w:type="spellEnd"/>
+    </w:p>
+    <w:p>
+      <w:pPr>
+        <w:pStyle w:val="ListParagraph"/>
+        <w:numPr>
+          <w:ilvl w:val="0"/>
+          <w:numId w:val="18"/>
+        </w:numPr>
+      </w:pPr>
+      <w:r>
+        <w:t>python 0_tools/apiSnapshot.py compare OLD NEW — compares two snapshots endpoint by endpoint, by status code and content hash.</w:t>
+      </w:r>
+      <w:proofErr w:type="gramStart"/>
+      <w:proofErr w:type="gramEnd"/>
+      <w:proofErr w:type="spellStart"/>
+      <w:proofErr w:type="spellEnd"/>
+      <w:proofErr w:type="spellStart"/>
+      <w:proofErr w:type="spellEnd"/>
+    </w:p>
+    <w:p>
+      <w:r>
+        <w:t>Endpoints that depend on the clock (/api/status, /api/sky/satellites and the GEO-belt charts) are still compared, but their differences are flagged as expected. Take the baseline before the first change, take a snapshot after each step, and explain every difference that isn’t expected. The database refactor used this throughout: a baseline on 2026-10-21, then one comparison per step; the results and every intended difference are in 0_testReports/261022_1130Z_dbRefactorRegression.md.</w:t>
+      </w:r>
+    </w:p>
+    <w:p>
+      <w:pPr>
+        <w:pStyle w:val="Heading2"/>
+      </w:pPr>
+      <w:r>
+        <w:t>Rehearsing Changes to the Live Server</w:t>
+      </w:r>
+    </w:p>
+    <w:p>
+      <w:r>
+        <w:t>A one-off change to the live server, such as a database migration, is rehearsed end to end on DEV first, on a copy of the app holding copies of the live databases under their live names and with the live server’s settings (for the refactor’s migration, CELESTRAK_ENABLED=0). The rehearsal runs the script’s dry run, then the real run, then its rollback, and compares API snapshots at each stage: after the migration against a snapshot taken just before it, and after the rollback against the same snapshot, which must match apart from the clock-dependent endpoints.</w:t>
+      </w:r>
+    </w:p>
+    <w:p>
+      <w:r>
+        <w:t>On the live server the same order applies: deploy with DRY_RUN=1 first and review what the sync would change or delete; deploy; check the site; run the script’s dry run and review its checks; run it for real, noting the backup and rollback command it prints; check the site, the freshness table and the first scheduled runs’ logs. scripts/migrateLive.py (2026-10-21) was rehearsed this way, and its tests in 0_tests/test_migrateLive.py cover the checks, the dry run and the rollback.</w:t>
       </w:r>
     </w:p>
     <w:p>

</xml_diff>